<commit_message>
fix: Update test cases for Prabowo Subianto's presidency references
</commit_message>
<xml_diff>
--- a/test_case/Test case.docx
+++ b/test_case/Test case.docx
@@ -31,12 +31,6 @@
         </w:rPr>
         <w:t xml:space="preserve"> </w:t>
       </w:r>
-      <w:r>
-        <w:rPr>
-          <w:lang w:val="fi-FI"/>
-        </w:rPr>
-        <w:t>(aman)</w:t>
-      </w:r>
     </w:p>
     <w:p>
       <w:pPr>
@@ -59,152 +53,7 @@
         <w:rPr>
           <w:lang w:val="fi-FI"/>
         </w:rPr>
-        <w:t xml:space="preserve"> (aman)</w:t>
-      </w:r>
-      <w:r>
-        <w:rPr>
-          <w:lang w:val="fi-FI"/>
-        </w:rPr>
         <w:t xml:space="preserve"> </w:t>
-      </w:r>
-    </w:p>
-    <w:p>
-      <w:pPr>
-        <w:pStyle w:val="ListParagraph"/>
-        <w:numPr>
-          <w:ilvl w:val="0"/>
-          <w:numId w:val="1"/>
-        </w:numPr>
-        <w:rPr>
-          <w:lang w:val="fi-FI"/>
-        </w:rPr>
-      </w:pPr>
-      <w:r>
-        <w:rPr>
-          <w:lang w:val="fi-FI"/>
-        </w:rPr>
-        <w:t>Prabowo subianto merupakan presiden ke-8</w:t>
-      </w:r>
-      <w:r>
-        <w:rPr>
-          <w:lang w:val="fi-FI"/>
-        </w:rPr>
-        <w:t xml:space="preserve"> </w:t>
-      </w:r>
-      <w:r>
-        <w:rPr>
-          <w:lang w:val="fi-FI"/>
-        </w:rPr>
-        <w:t>(aman)</w:t>
-      </w:r>
-    </w:p>
-    <w:p>
-      <w:pPr>
-        <w:pStyle w:val="ListParagraph"/>
-        <w:numPr>
-          <w:ilvl w:val="0"/>
-          <w:numId w:val="1"/>
-        </w:numPr>
-        <w:rPr>
-          <w:lang w:val="fi-FI"/>
-        </w:rPr>
-      </w:pPr>
-      <w:r>
-        <w:rPr>
-          <w:lang w:val="fi-FI"/>
-        </w:rPr>
-        <w:t>Prabowo subianto merupakan presiden ke-10</w:t>
-      </w:r>
-      <w:r>
-        <w:rPr>
-          <w:lang w:val="fi-FI"/>
-        </w:rPr>
-        <w:t xml:space="preserve"> </w:t>
-      </w:r>
-      <w:r>
-        <w:rPr>
-          <w:lang w:val="fi-FI"/>
-        </w:rPr>
-        <w:t>(aman)</w:t>
-      </w:r>
-    </w:p>
-    <w:p>
-      <w:pPr>
-        <w:pStyle w:val="ListParagraph"/>
-        <w:numPr>
-          <w:ilvl w:val="0"/>
-          <w:numId w:val="1"/>
-        </w:numPr>
-      </w:pPr>
-      <w:r>
-        <w:t xml:space="preserve">Prabowo </w:t>
-      </w:r>
-      <w:proofErr w:type="spellStart"/>
-      <w:r>
-        <w:t>merupakan</w:t>
-      </w:r>
-      <w:proofErr w:type="spellEnd"/>
-      <w:r>
-        <w:t xml:space="preserve"> </w:t>
-      </w:r>
-      <w:proofErr w:type="spellStart"/>
-      <w:r>
-        <w:t>presiden</w:t>
-      </w:r>
-      <w:proofErr w:type="spellEnd"/>
-      <w:r>
-        <w:t xml:space="preserve"> ke-8</w:t>
-      </w:r>
-      <w:r>
-        <w:t xml:space="preserve"> </w:t>
-      </w:r>
-    </w:p>
-    <w:p>
-      <w:pPr>
-        <w:pStyle w:val="ListParagraph"/>
-        <w:numPr>
-          <w:ilvl w:val="0"/>
-          <w:numId w:val="1"/>
-        </w:numPr>
-        <w:rPr>
-          <w:lang w:val="fi-FI"/>
-        </w:rPr>
-      </w:pPr>
-      <w:r>
-        <w:rPr>
-          <w:lang w:val="fi-FI"/>
-        </w:rPr>
-        <w:t>Prabowo merupkaan presiden ke-10</w:t>
-      </w:r>
-    </w:p>
-    <w:p>
-      <w:pPr>
-        <w:pStyle w:val="ListParagraph"/>
-        <w:numPr>
-          <w:ilvl w:val="0"/>
-          <w:numId w:val="1"/>
-        </w:numPr>
-        <w:rPr>
-          <w:lang w:val="fi-FI"/>
-        </w:rPr>
-      </w:pPr>
-      <w:r>
-        <w:rPr>
-          <w:lang w:val="fi-FI"/>
-        </w:rPr>
-        <w:t>J</w:t>
-      </w:r>
-      <w:r>
-        <w:rPr>
-          <w:lang w:val="fi-FI"/>
-        </w:rPr>
-        <w:t>oko Widodo</w:t>
-      </w:r>
-      <w:r>
-        <w:rPr>
-          <w:lang w:val="fi-FI"/>
-        </w:rPr>
-        <w:t xml:space="preserve"> merupakan presiden ke-7</w:t>
       </w:r>
     </w:p>
     <w:sectPr>

</xml_diff>